<commit_message>
Add Bricksmith Databricks-branded Agentforce-to-Zerobus architecture figure.
Include the Phase A/B diagram in markdown, PDF, and DOCX so Suncorp can see the Private Link production path versus the public FEVM lab.
</commit_message>
<xml_diff>
--- a/docs/Suncorp_Agentforce_OTel_Databricks_Readout.docx
+++ b/docs/Suncorp_Agentforce_OTel_Databricks_Readout.docx
@@ -84,7 +84,7 @@
       </w:r>
     </w:p>
     <w:bookmarkEnd w:id="9"/>
-    <w:bookmarkStart w:id="38" w:name="suncorp-recommended-test-setup"/>
+    <w:bookmarkStart w:id="44" w:name="suncorp-recommended-test-setup"/>
     <w:p>
       <w:pPr>
         <w:pStyle w:val="Heading1"/>
@@ -95,7 +95,62 @@
     </w:p>
     <w:p>
       <w:pPr>
-        <w:pStyle w:val="FirstParagraph"/>
+        <w:pStyle w:val="CaptionedFigure"/>
+      </w:pPr>
+      <w:r>
+        <w:drawing>
+          <wp:inline>
+            <wp:extent cx="5334000" cy="3556000"/>
+            <wp:effectExtent b="0" l="0" r="0" t="0"/>
+            <wp:docPr descr="Suncorp Agentforce OpenTelemetry to Databricks Lakehouse" title="" id="11" name="Picture"/>
+            <a:graphic>
+              <a:graphicData uri="http://schemas.openxmlformats.org/drawingml/2006/picture">
+                <pic:pic>
+                  <pic:nvPicPr>
+                    <pic:cNvPr descr="diagrams/suncorp_agentforce_otel_zerobus.png" id="12" name="Picture"/>
+                    <pic:cNvPicPr>
+                      <a:picLocks noChangeArrowheads="1" noChangeAspect="1"/>
+                    </pic:cNvPicPr>
+                  </pic:nvPicPr>
+                  <pic:blipFill>
+                    <a:blip r:embed="rId10"/>
+                    <a:stretch>
+                      <a:fillRect/>
+                    </a:stretch>
+                  </pic:blipFill>
+                  <pic:spPr bwMode="auto">
+                    <a:xfrm>
+                      <a:off x="0" y="0"/>
+                      <a:ext cx="5334000" cy="3556000"/>
+                    </a:xfrm>
+                    <a:prstGeom prst="rect">
+                      <a:avLst/>
+                    </a:prstGeom>
+                    <a:noFill/>
+                    <a:ln w="9525">
+                      <a:noFill/>
+                      <a:headEnd/>
+                      <a:tailEnd/>
+                    </a:ln>
+                  </pic:spPr>
+                </pic:pic>
+              </a:graphicData>
+            </a:graphic>
+          </wp:inline>
+        </w:drawing>
+      </w:r>
+    </w:p>
+    <w:p>
+      <w:pPr>
+        <w:pStyle w:val="ImageCaption"/>
+      </w:pPr>
+      <w:r>
+        <w:t xml:space="preserve">Suncorp Agentforce OpenTelemetry to Databricks Lakehouse</w:t>
+      </w:r>
+    </w:p>
+    <w:p>
+      <w:pPr>
+        <w:pStyle w:val="BodyText"/>
       </w:pPr>
       <w:r>
         <w:t xml:space="preserve">Suncorp wants Agentforce OTel traces in Databricks for centralised AI</w:t>
@@ -362,7 +417,7 @@
         <w:t xml:space="preserve">requires VPC endpoints, private DNS, and a collector in a Suncorp VPC.</w:t>
       </w:r>
     </w:p>
-    <w:bookmarkStart w:id="10" w:name="phase-a-already-demonstrated-fevm"/>
+    <w:bookmarkStart w:id="13" w:name="phase-a-already-demonstrated-fevm"/>
     <w:p>
       <w:pPr>
         <w:pStyle w:val="Heading2"/>
@@ -801,8 +856,8 @@
         <w:t xml:space="preserve">;</w:t>
       </w:r>
     </w:p>
-    <w:bookmarkEnd w:id="10"/>
-    <w:bookmarkStart w:id="16" w:name="X8b7afb31ac62aef2193fff6b5ecc6a1a33e82eb"/>
+    <w:bookmarkEnd w:id="13"/>
+    <w:bookmarkStart w:id="19" w:name="X8b7afb31ac62aef2193fff6b5ecc6a1a33e82eb"/>
     <w:p>
       <w:pPr>
         <w:pStyle w:val="Heading2"/>
@@ -856,7 +911,7 @@
       <w:r>
         <w:t xml:space="preserve"> </w:t>
       </w:r>
-      <w:hyperlink r:id="rId11">
+      <w:hyperlink r:id="rId14">
         <w:r>
           <w:rPr>
             <w:rStyle w:val="Hyperlink"/>
@@ -873,7 +928,7 @@
       <w:r>
         <w:t xml:space="preserve"> </w:t>
       </w:r>
-      <w:hyperlink r:id="rId12">
+      <w:hyperlink r:id="rId15">
         <w:r>
           <w:rPr>
             <w:rStyle w:val="Hyperlink"/>
@@ -901,7 +956,7 @@
         <w:t xml:space="preserve">).</w:t>
       </w:r>
     </w:p>
-    <w:bookmarkStart w:id="13" w:name="Xf1752512b8fbb43669412fba22ad4e0b08fcdb1"/>
+    <w:bookmarkStart w:id="16" w:name="Xf1752512b8fbb43669412fba22ad4e0b08fcdb1"/>
     <w:p>
       <w:pPr>
         <w:pStyle w:val="Heading3"/>
@@ -1321,8 +1376,8 @@
         <w:t xml:space="preserve">(or an approved egress to Salesforce API hostnames).</w:t>
       </w:r>
     </w:p>
-    <w:bookmarkEnd w:id="13"/>
-    <w:bookmarkStart w:id="14" w:name="phase-b-test-cases-run-from-the-vpc"/>
+    <w:bookmarkEnd w:id="16"/>
+    <w:bookmarkStart w:id="17" w:name="phase-b-test-cases-run-from-the-vpc"/>
     <w:p>
       <w:pPr>
         <w:pStyle w:val="Heading3"/>
@@ -1753,8 +1808,8 @@
         <w:t xml:space="preserve">That is the evidence Suncorp’s “full Private Link” control is doing work.</w:t>
       </w:r>
     </w:p>
-    <w:bookmarkEnd w:id="14"/>
-    <w:bookmarkStart w:id="15" w:name="suggested-owners"/>
+    <w:bookmarkEnd w:id="17"/>
+    <w:bookmarkStart w:id="18" w:name="suggested-owners"/>
     <w:p>
       <w:pPr>
         <w:pStyle w:val="Heading3"/>
@@ -1922,9 +1977,9 @@
         </w:tc>
       </w:tr>
     </w:tbl>
-    <w:bookmarkEnd w:id="15"/>
-    <w:bookmarkEnd w:id="16"/>
-    <w:bookmarkStart w:id="17" w:name="recommended-sequence-for-suncorp"/>
+    <w:bookmarkEnd w:id="18"/>
+    <w:bookmarkEnd w:id="19"/>
+    <w:bookmarkStart w:id="20" w:name="recommended-sequence-for-suncorp"/>
     <w:p>
       <w:pPr>
         <w:pStyle w:val="Heading2"/>
@@ -2043,8 +2098,8 @@
         <w:t xml:space="preserve">Only then discuss HA (EKS), logs/metrics tables, and MLflow eval on VARIANT.</w:t>
       </w:r>
     </w:p>
-    <w:bookmarkEnd w:id="17"/>
-    <w:bookmarkStart w:id="18" w:name="out-of-scope-until-phase-b-exists"/>
+    <w:bookmarkEnd w:id="20"/>
+    <w:bookmarkStart w:id="24" w:name="out-of-scope-until-phase-b-exists"/>
     <w:p>
       <w:pPr>
         <w:pStyle w:val="Heading2"/>
@@ -2117,8 +2172,96 @@
         <w:t xml:space="preserve"># Architecture — Agentforce OTel → Databricks Zerobus (Suncorp demo)</w:t>
       </w:r>
     </w:p>
-    <w:bookmarkEnd w:id="18"/>
-    <w:bookmarkStart w:id="20" w:name="production-target-four-layers"/>
+    <w:p>
+      <w:pPr>
+        <w:pStyle w:val="FirstParagraph"/>
+      </w:pPr>
+      <w:r>
+        <w:t xml:space="preserve">Bricksmith / Databricks-branded target architecture (Phase A data path plus Phase B Private Link):</w:t>
+      </w:r>
+    </w:p>
+    <w:p>
+      <w:pPr>
+        <w:pStyle w:val="CaptionedFigure"/>
+      </w:pPr>
+      <w:r>
+        <w:drawing>
+          <wp:inline>
+            <wp:extent cx="5334000" cy="3556000"/>
+            <wp:effectExtent b="0" l="0" r="0" t="0"/>
+            <wp:docPr descr="Suncorp Agentforce OpenTelemetry to Databricks Lakehouse" title="" id="21" name="Picture"/>
+            <a:graphic>
+              <a:graphicData uri="http://schemas.openxmlformats.org/drawingml/2006/picture">
+                <pic:pic>
+                  <pic:nvPicPr>
+                    <pic:cNvPr descr="diagrams/suncorp_agentforce_otel_zerobus.png" id="22" name="Picture"/>
+                    <pic:cNvPicPr>
+                      <a:picLocks noChangeArrowheads="1" noChangeAspect="1"/>
+                    </pic:cNvPicPr>
+                  </pic:nvPicPr>
+                  <pic:blipFill>
+                    <a:blip r:embed="rId10"/>
+                    <a:stretch>
+                      <a:fillRect/>
+                    </a:stretch>
+                  </pic:blipFill>
+                  <pic:spPr bwMode="auto">
+                    <a:xfrm>
+                      <a:off x="0" y="0"/>
+                      <a:ext cx="5334000" cy="3556000"/>
+                    </a:xfrm>
+                    <a:prstGeom prst="rect">
+                      <a:avLst/>
+                    </a:prstGeom>
+                    <a:noFill/>
+                    <a:ln w="9525">
+                      <a:noFill/>
+                      <a:headEnd/>
+                      <a:tailEnd/>
+                    </a:ln>
+                  </pic:spPr>
+                </pic:pic>
+              </a:graphicData>
+            </a:graphic>
+          </wp:inline>
+        </w:drawing>
+      </w:r>
+    </w:p>
+    <w:p>
+      <w:pPr>
+        <w:pStyle w:val="ImageCaption"/>
+      </w:pPr>
+      <w:r>
+        <w:t xml:space="preserve">Suncorp Agentforce OpenTelemetry to Databricks Lakehouse</w:t>
+      </w:r>
+    </w:p>
+    <w:p>
+      <w:pPr>
+        <w:pStyle w:val="BodyText"/>
+      </w:pPr>
+      <w:r>
+        <w:t xml:space="preserve">Prompt used to generate the figure:</w:t>
+      </w:r>
+      <w:r>
+        <w:t xml:space="preserve"> </w:t>
+      </w:r>
+      <w:hyperlink r:id="rId23">
+        <w:r>
+          <w:rPr>
+            <w:rStyle w:val="Hyperlink"/>
+          </w:rPr>
+          <w:t xml:space="preserve">suncorp_agentforce_otel_zerobus.txt</w:t>
+        </w:r>
+      </w:hyperlink>
+      <w:r>
+        <w:t xml:space="preserve"> </w:t>
+      </w:r>
+      <w:r>
+        <w:t xml:space="preserve">(Bricksmith + Databricks brand style + Unity Catalog / Delta / Databricks logos).</w:t>
+      </w:r>
+    </w:p>
+    <w:bookmarkEnd w:id="24"/>
+    <w:bookmarkStart w:id="26" w:name="production-target-four-layers"/>
     <w:p>
       <w:pPr>
         <w:pStyle w:val="Heading2"/>
@@ -2311,7 +2454,7 @@
       <w:r>
         <w:t xml:space="preserve"> </w:t>
       </w:r>
-      <w:hyperlink r:id="rId19">
+      <w:hyperlink r:id="rId25">
         <w:r>
           <w:rPr>
             <w:rStyle w:val="Hyperlink"/>
@@ -2323,8 +2466,8 @@
         <w:t xml:space="preserve">.</w:t>
       </w:r>
     </w:p>
-    <w:bookmarkEnd w:id="20"/>
-    <w:bookmarkStart w:id="21" w:name="why-a-collector"/>
+    <w:bookmarkEnd w:id="26"/>
+    <w:bookmarkStart w:id="27" w:name="why-a-collector"/>
     <w:p>
       <w:pPr>
         <w:pStyle w:val="Heading2"/>
@@ -2403,8 +2546,8 @@
         <w:t xml:space="preserve">hop (VPC → Private Link → Zerobus).</w:t>
       </w:r>
     </w:p>
-    <w:bookmarkEnd w:id="21"/>
-    <w:bookmarkStart w:id="22" w:name="why-a-poller"/>
+    <w:bookmarkEnd w:id="27"/>
+    <w:bookmarkStart w:id="28" w:name="why-a-poller"/>
     <w:p>
       <w:pPr>
         <w:pStyle w:val="Heading2"/>
@@ -2572,8 +2715,8 @@
         <w:t xml:space="preserve">fills a deterministic 8-byte ID so Zerobus accepts the batch.</w:t>
       </w:r>
     </w:p>
-    <w:bookmarkEnd w:id="22"/>
-    <w:bookmarkStart w:id="23" w:name="lab-vs-production"/>
+    <w:bookmarkEnd w:id="28"/>
+    <w:bookmarkStart w:id="29" w:name="lab-vs-production"/>
     <w:p>
       <w:pPr>
         <w:pStyle w:val="Heading2"/>
@@ -2854,8 +2997,8 @@
         </w:tc>
       </w:tr>
     </w:tbl>
-    <w:bookmarkEnd w:id="23"/>
-    <w:bookmarkStart w:id="24" w:name="demo-environment-this-repo"/>
+    <w:bookmarkEnd w:id="29"/>
+    <w:bookmarkStart w:id="30" w:name="demo-environment-this-repo"/>
     <w:p>
       <w:pPr>
         <w:pStyle w:val="Heading2"/>
@@ -3146,8 +3289,8 @@
         </w:tc>
       </w:tr>
     </w:tbl>
-    <w:bookmarkEnd w:id="24"/>
-    <w:bookmarkStart w:id="25" w:name="key-advantages-for-suncorp"/>
+    <w:bookmarkEnd w:id="30"/>
+    <w:bookmarkStart w:id="31" w:name="key-advantages-for-suncorp"/>
     <w:p>
       <w:pPr>
         <w:pStyle w:val="Heading2"/>
@@ -3266,8 +3409,8 @@
         <w:t xml:space="preserve">— preserve high-cardinality Agentforce prompt/tool metadata</w:t>
       </w:r>
     </w:p>
-    <w:bookmarkEnd w:id="25"/>
-    <w:bookmarkStart w:id="30" w:name="references"/>
+    <w:bookmarkEnd w:id="31"/>
+    <w:bookmarkStart w:id="36" w:name="references"/>
     <w:p>
       <w:pPr>
         <w:pStyle w:val="Heading2"/>
@@ -3284,7 +3427,7 @@
           <w:numId w:val="1006"/>
         </w:numPr>
       </w:pPr>
-      <w:hyperlink r:id="rId26">
+      <w:hyperlink r:id="rId32">
         <w:r>
           <w:rPr>
             <w:rStyle w:val="Hyperlink"/>
@@ -3301,7 +3444,7 @@
           <w:numId w:val="1006"/>
         </w:numPr>
       </w:pPr>
-      <w:hyperlink r:id="rId27">
+      <w:hyperlink r:id="rId33">
         <w:r>
           <w:rPr>
             <w:rStyle w:val="Hyperlink"/>
@@ -3318,7 +3461,7 @@
           <w:numId w:val="1006"/>
         </w:numPr>
       </w:pPr>
-      <w:hyperlink r:id="rId28">
+      <w:hyperlink r:id="rId34">
         <w:r>
           <w:rPr>
             <w:rStyle w:val="Hyperlink"/>
@@ -3335,7 +3478,7 @@
           <w:numId w:val="1006"/>
         </w:numPr>
       </w:pPr>
-      <w:hyperlink r:id="rId11">
+      <w:hyperlink r:id="rId14">
         <w:r>
           <w:rPr>
             <w:rStyle w:val="Hyperlink"/>
@@ -3352,7 +3495,7 @@
           <w:numId w:val="1006"/>
         </w:numPr>
       </w:pPr>
-      <w:hyperlink r:id="rId12">
+      <w:hyperlink r:id="rId15">
         <w:r>
           <w:rPr>
             <w:rStyle w:val="Hyperlink"/>
@@ -3369,7 +3512,7 @@
           <w:numId w:val="1006"/>
         </w:numPr>
       </w:pPr>
-      <w:hyperlink r:id="rId29">
+      <w:hyperlink r:id="rId35">
         <w:r>
           <w:rPr>
             <w:rStyle w:val="Hyperlink"/>
@@ -3492,8 +3635,8 @@
         <w:t xml:space="preserve">Copilot_for_Salesforce</w:t>
       </w:r>
     </w:p>
-    <w:bookmarkEnd w:id="30"/>
-    <w:bookmarkStart w:id="31" w:name="current-org-status-24-oct-2026"/>
+    <w:bookmarkEnd w:id="36"/>
+    <w:bookmarkStart w:id="37" w:name="current-org-status-24-oct-2026"/>
     <w:p>
       <w:pPr>
         <w:pStyle w:val="Heading2"/>
@@ -4044,8 +4187,8 @@
         <w:t xml:space="preserve">for 15–60+ minutes.</w:t>
       </w:r>
     </w:p>
-    <w:bookmarkEnd w:id="31"/>
-    <w:bookmarkStart w:id="32" w:name="enable-agentforce"/>
+    <w:bookmarkEnd w:id="37"/>
+    <w:bookmarkStart w:id="38" w:name="enable-agentforce"/>
     <w:p>
       <w:pPr>
         <w:pStyle w:val="Heading2"/>
@@ -4116,8 +4259,8 @@
         <w:t xml:space="preserve">’d)</w:t>
       </w:r>
     </w:p>
-    <w:bookmarkEnd w:id="32"/>
-    <w:bookmarkStart w:id="33" w:name="enable-data-360-session-tracing-audit"/>
+    <w:bookmarkEnd w:id="38"/>
+    <w:bookmarkStart w:id="39" w:name="enable-data-360-session-tracing-audit"/>
     <w:p>
       <w:pPr>
         <w:pStyle w:val="Heading2"/>
@@ -4367,8 +4510,8 @@
         <w:t xml:space="preserve">disabled); Genie starter PSL is the DE licence.</w:t>
       </w:r>
     </w:p>
-    <w:bookmarkEnd w:id="33"/>
-    <w:bookmarkStart w:id="34" w:name="activate-data-360-streams"/>
+    <w:bookmarkEnd w:id="39"/>
+    <w:bookmarkStart w:id="40" w:name="activate-data-360-streams"/>
     <w:p>
       <w:pPr>
         <w:pStyle w:val="Heading2"/>
@@ -4497,8 +4640,8 @@
         <w:t xml:space="preserve">in this lab.</w:t>
       </w:r>
     </w:p>
-    <w:bookmarkEnd w:id="34"/>
-    <w:bookmarkStart w:id="35" w:name="generate-a-traced-session-cli"/>
+    <w:bookmarkEnd w:id="40"/>
+    <w:bookmarkStart w:id="41" w:name="generate-a-traced-session-cli"/>
     <w:p>
       <w:pPr>
         <w:pStyle w:val="Heading2"/>
@@ -4732,8 +4875,8 @@
         <w:t xml:space="preserve">custom bot often never lands in Session Tracing.</w:t>
       </w:r>
     </w:p>
-    <w:bookmarkEnd w:id="35"/>
-    <w:bookmarkStart w:id="36" w:name="poll-otel"/>
+    <w:bookmarkEnd w:id="41"/>
+    <w:bookmarkStart w:id="42" w:name="poll-otel"/>
     <w:p>
       <w:pPr>
         <w:pStyle w:val="Heading2"/>
@@ -4996,8 +5139,8 @@
         <w:t xml:space="preserve"> poller/poll_agentforce.py</w:t>
       </w:r>
     </w:p>
-    <w:bookmarkEnd w:id="36"/>
-    <w:bookmarkStart w:id="37" w:name="X4b90944f0b9ade6b685d51754b57e806b693259"/>
+    <w:bookmarkEnd w:id="42"/>
+    <w:bookmarkStart w:id="43" w:name="X4b90944f0b9ade6b685d51754b57e806b693259"/>
     <w:p>
       <w:pPr>
         <w:pStyle w:val="Heading2"/>
@@ -5206,8 +5349,8 @@
         <w:t xml:space="preserve">.</w:t>
       </w:r>
     </w:p>
-    <w:bookmarkEnd w:id="37"/>
-    <w:bookmarkEnd w:id="38"/>
+    <w:bookmarkEnd w:id="43"/>
+    <w:bookmarkEnd w:id="44"/>
     <w:sectPr>
       <w:footnotePr>
         <w:numRestart w:val="eachSect"/>

</xml_diff>

<commit_message>
Add the produce-and-inspect runbook and tighten readout tone.
Document how to generate an Agentforce session, which Unity Catalog tables to query, and what a successful Zerobus write looks like.
</commit_message>
<xml_diff>
--- a/docs/Suncorp_Agentforce_OTel_Databricks_Readout.docx
+++ b/docs/Suncorp_Agentforce_OTel_Databricks_Readout.docx
@@ -42,7 +42,7 @@
           <w:color w:val="374151"/>
           <w:sz w:val="22"/>
         </w:rPr>
-        <w:t>How Salesforce Agentforce session traces reach Unity Catalog Delta tables through a telemetry bridge on EKS, and where AWS Private Link attaches for Suncorp.</w:t>
+        <w:t>How Salesforce Agentforce session traces reach Unity Catalog Delta tables: session export GET, Protobuf POST to Zerobus Ingest OTLP, and where AWS Private Link attaches for Suncorp.</w:t>
       </w:r>
     </w:p>
     <w:tbl>
@@ -201,7 +201,7 @@
                 <w:color w:val="374151"/>
                 <w:sz w:val="19"/>
               </w:rPr>
-              <w:t>Centralised AI observability for Salesforce Agentforce on Databricks (AWS)</w:t>
+              <w:t>Land Agentforce session traces in Unity Catalog Delta via Zerobus Ingest OTLP</w:t>
             </w:r>
           </w:p>
         </w:tc>
@@ -518,7 +518,7 @@
           <w:color w:val="374151"/>
           <w:sz w:val="22"/>
         </w:rPr>
-        <w:t xml:space="preserve"> is the poller and OpenTelemetry Collector pair. The poller is the Salesforce client. The Collector is the Zerobus client and runs in the VPC.</w:t>
+        <w:t xml:space="preserve"> is the poller plus a Zerobus client. The poller is the Salesforce client. The Zerobus client is the poller itself (Phase A1) or an OpenTelemetry Collector in the VPC (Phase A2). This lab hosted the Collector on EKS Fargate.</w:t>
       </w:r>
     </w:p>
     <w:p>
@@ -546,7 +546,7 @@
           <w:color w:val="374151"/>
           <w:sz w:val="22"/>
         </w:rPr>
-        <w:t>Suncorp runs customer-facing work on Salesforce Agentforce: LLM reasoning, tool calls, and CRM actions. Platform and risk teams need the same traces in Databricks so they can query conversations, run evaluations, and retain the data with the rest of the lakehouse. Suncorp workspaces use AWS front-end Private Link. The ingest path is Zerobus Ingest OTLP into Delta.</w:t>
+        <w:t>Suncorp runs customer-facing work on Salesforce Agentforce: LLM reasoning, tool calls, and CRM actions. Platform and risk teams query those traces in Databricks, run evaluations, and retain them with the rest of the lakehouse. Suncorp workspaces use AWS front-end Private Link. The ingest path is Zerobus Ingest OTLP into Delta. Delay follows Data 360 catch-up and the poll interval, typically tens of seconds to a few minutes after the session is readable in Salesforce.</w:t>
       </w:r>
     </w:p>
     <w:p>
@@ -633,7 +633,7 @@
           <w:color w:val="374151"/>
           <w:sz w:val="22"/>
         </w:rPr>
-        <w:t>Data 360 DMOs such as ssot__TelemetryTraceSpan__dlm offer a second read path through SOQL. In OpenTelemetry terms, an exporter POSTs OTLP to a URL you configure. The Salesforce endpoint is a session export GET, so the integration calls Salesforce and receives the payload.</w:t>
+        <w:t>Data 360 DMOs such as ssot__TelemetryTraceSpan__dlm offer a second read path through SOQL. OTLP is the OpenTelemetry Protocol for traces, metrics, and logs over HTTP or gRPC. Zerobus Ingest OTLP accepts that protocol as Protobuf on POST. The Salesforce endpoint returns OTLP-shaped JSON on GET.</w:t>
       </w:r>
     </w:p>
     <w:p>
@@ -1132,7 +1132,7 @@
           <w:color w:val="374151"/>
           <w:sz w:val="22"/>
         </w:rPr>
-        <w:t>The poller implements the Salesforce client and acts as the OTLP exporter for Agentforce. The Collector implements the Zerobus client and is the long-lived push process in the VPC.</w:t>
+        <w:t>The poller is the Salesforce client. It can POST Protobuf straight to Zerobus (Phase A1). The Collector is the standing Databricks client for token refresh, batching, and Private Link egress from a VPC (Phase A2). Production can host that client on EKS, ECS, a small VM, or a scheduled function.</w:t>
       </w:r>
     </w:p>
     <w:p>
@@ -1160,7 +1160,7 @@
           <w:color w:val="374151"/>
           <w:sz w:val="22"/>
         </w:rPr>
-        <w:t>Figure 1 reads left to right. Agentforce writes sessions into Data 360. The poller GETs the session JSON (PULL GET OTel JSON). Inside the AWS VPC, the poller POSTs Protobuf to the OpenTelemetry Collector on EKS Fargate (PUSH Protobuf), and the Collector POSTs to Zerobus (PUSH OTLP Protobuf to Zerobus). Zerobus returns HTTP 200 once the write is durable.</w:t>
+        <w:t>Figure 1 reads left to right. Agentforce writes sessions into Data 360. The poller GETs the session JSON (PULL GET OTel JSON). The poller POSTs Protobuf to the Collector (PUSH Protobuf), and the Collector POSTs to Zerobus (PUSH OTLP Protobuf to Zerobus). Zerobus returns HTTP 200 once the write is durable. Phase A1 used the same Protobuf POST from the laptop with the Collector omitted.</w:t>
       </w:r>
     </w:p>
     <w:p>
@@ -1511,7 +1511,7 @@
                 <w:color w:val="374151"/>
                 <w:sz w:val="19"/>
               </w:rPr>
-              <w:t>AWS VPC (laptop in the lab)</w:t>
+              <w:t>Laptop in the lab; Suncorp VPC in production</w:t>
             </w:r>
           </w:p>
         </w:tc>
@@ -1535,7 +1535,7 @@
                 <w:color w:val="374151"/>
                 <w:sz w:val="19"/>
               </w:rPr>
-              <w:t>Discovers finished sessions, GETs JSON, converts to Protobuf, fills empty spanIds, POSTs to the Collector.</w:t>
+              <w:t>Discovers finished sessions, GETs JSON, converts to Protobuf, fills empty spanIds, POSTs to the Collector or to Zerobus.</w:t>
             </w:r>
           </w:p>
         </w:tc>
@@ -1997,7 +1997,7 @@
                 <w:color w:val="374151"/>
                 <w:sz w:val="19"/>
               </w:rPr>
-              <w:t>OpenTelemetry Collector on EKS Fargate in an AWS VPC, POSTing to public Zerobus.</w:t>
+              <w:t>OpenTelemetry Collector in an AWS VPC (lab host: EKS Fargate), POSTing to public Zerobus.</w:t>
             </w:r>
           </w:p>
         </w:tc>
@@ -2129,7 +2129,7 @@
           <w:color w:val="374151"/>
           <w:sz w:val="22"/>
         </w:rPr>
-        <w:t>A1 posted Protobuf directly to Zerobus while local Docker was unavailable. A2 runs the Collector in an AWS VPC, which is the pattern Suncorp copies. FEVM fevm-ot-pdm-semi is a public workspace, so A2 uses the public Zerobus hostname. Manifests are in otel-collector/k8s/.</w:t>
+        <w:t>A1 posted Protobuf from the laptop to public Zerobus. A2 runs the Collector in a VPC on the same public hostname. FEVM fevm-ot-pdm-semi is a public workspace. Suncorp copies the Collector-in-VPC pattern onto Private Link. Manifests are in otel-collector/k8s/.</w:t>
       </w:r>
     </w:p>
     <w:p>
@@ -2790,7 +2790,7 @@
           <w:color w:val="1B3139"/>
           <w:sz w:val="32"/>
         </w:rPr>
-        <w:t>9. Delivery implication</w:t>
+        <w:t>9. Produce traces and inspect tables</w:t>
       </w:r>
     </w:p>
     <w:p>
@@ -2805,7 +2805,501 @@
           <w:color w:val="374151"/>
           <w:sz w:val="22"/>
         </w:rPr>
-        <w:t>Suncorp reuses the EKS manifests in its own VPC, swaps the workspace id, catalog, and schema, and keeps Protobuf with x-databricks-zerobus-table-name. Suncorp networking provisions the VPC endpoint and private DNS for Zerobus OTLP. The poller moves into the same VPC as the Collector and authenticates to Salesforce through an External Client App. VARIANT columns keep prompt and tool payloads available for MLflow evaluation, and Delta Sharing can return curated aggregates to Data Cloud once traces land in Delta.</w:t>
+        <w:t>Catalog ot_pdm_semi_catalog.agentforce_otel. Use the Suncorp Pilot SQL warehouse. DDL is sql/01_create_otel_tables.sql. Repeatable queries are sql/02_demo_queries.sql.</w:t>
+      </w:r>
+    </w:p>
+    <w:p>
+      <w:pPr>
+        <w:pStyle w:val="Heading2"/>
+      </w:pPr>
+      <w:r>
+        <w:rPr>
+          <w:rFonts w:ascii="Calibri" w:hAnsi="Calibri"/>
+          <w:color w:val="1B3139"/>
+          <w:sz w:val="26"/>
+        </w:rPr>
+        <w:t>9.1 Produce an Agentforce session</w:t>
+      </w:r>
+    </w:p>
+    <w:p>
+      <w:pPr>
+        <w:spacing w:after="160" w:line="240" w:lineRule="auto"/>
+        <w:jc w:val="both"/>
+      </w:pPr>
+      <w:r>
+        <w:rPr>
+          <w:rFonts w:ascii="Calibri" w:hAnsi="Calibri" w:eastAsia="Calibri"/>
+          <w:b w:val="0"/>
+          <w:color w:val="374151"/>
+          <w:sz w:val="22"/>
+        </w:rPr>
+        <w:t>Produce a session: enable Session Tracing and Einstein Audit (dataspace default), then chat with Agentforce (Default) or run sf agent test run --api-name OTel_Demo_Test --target-org orgfarm918 --wait 10 --verbose. Lab utterance: Hello, what can you do? Expected topic: GeneralCRM. Copy generatedData.sessionId.</w:t>
+      </w:r>
+    </w:p>
+    <w:p>
+      <w:pPr>
+        <w:spacing w:after="160" w:line="240" w:lineRule="auto"/>
+        <w:jc w:val="both"/>
+      </w:pPr>
+      <w:r>
+        <w:rPr>
+          <w:rFonts w:ascii="Calibri" w:hAnsi="Calibri" w:eastAsia="Calibri"/>
+          <w:b w:val="0"/>
+          <w:color w:val="374151"/>
+          <w:sz w:val="22"/>
+        </w:rPr>
+        <w:t>Wait for Data 360 catch-up (often several minutes). Run DRY_RUN=true python3 poller/poll_agentforce.py. Observe a session id, span count greater than zero, and complete status. Empty spans means Data 360 is still catching up.</w:t>
+      </w:r>
+    </w:p>
+    <w:p>
+      <w:pPr>
+        <w:pStyle w:val="Heading2"/>
+      </w:pPr>
+      <w:r>
+        <w:rPr>
+          <w:rFonts w:ascii="Calibri" w:hAnsi="Calibri"/>
+          <w:color w:val="1B3139"/>
+          <w:sz w:val="26"/>
+        </w:rPr>
+        <w:t>9.2 POST to Zerobus</w:t>
+      </w:r>
+    </w:p>
+    <w:p>
+      <w:pPr>
+        <w:spacing w:after="160" w:line="240" w:lineRule="auto"/>
+        <w:jc w:val="both"/>
+      </w:pPr>
+      <w:r>
+        <w:rPr>
+          <w:rFonts w:ascii="Calibri" w:hAnsi="Calibri" w:eastAsia="Calibri"/>
+          <w:b w:val="0"/>
+          <w:color w:val="374151"/>
+          <w:sz w:val="22"/>
+        </w:rPr>
+        <w:t>POST Protobuf. Phase A1: set OTEL_COLLECTOR_TRACES_URL to https://{WORKSPACE_ID}.zerobus.{REGION}.cloud.databricks.com:443/v1/traces and run poller/poll_agentforce.py with SALESFORCE_SESSION_ID. Phase A2: kubectl port-forward svc/otel-collector 4318:4318 and POST to http://127.0.0.1:4318/v1/traces. Observe Exported N span(s) and HTTP 200. Synthetic check: python3 scripts/send_direct_zerobus.py.</w:t>
+      </w:r>
+    </w:p>
+    <w:p>
+      <w:pPr>
+        <w:pStyle w:val="Heading2"/>
+      </w:pPr>
+      <w:r>
+        <w:rPr>
+          <w:rFonts w:ascii="Calibri" w:hAnsi="Calibri"/>
+          <w:color w:val="1B3139"/>
+          <w:sz w:val="26"/>
+        </w:rPr>
+        <w:t>9.3 Tables and what to look for</w:t>
+      </w:r>
+    </w:p>
+    <w:tbl>
+      <w:tblPr>
+        <w:tblW w:type="auto" w:w="0"/>
+        <w:jc w:val="center"/>
+        <w:tblLayout w:type="autofit"/>
+        <w:tblLook w:firstColumn="1" w:firstRow="1" w:lastColumn="0" w:lastRow="0" w:noHBand="0" w:noVBand="1" w:val="04A0"/>
+      </w:tblPr>
+      <w:tblGrid>
+        <w:gridCol w:w="3137"/>
+        <w:gridCol w:w="3137"/>
+        <w:gridCol w:w="3137"/>
+      </w:tblGrid>
+      <w:tr>
+        <w:tc>
+          <w:tcPr>
+            <w:tcW w:type="dxa" w:w="3137"/>
+            <w:shd w:fill="1B3139" w:val="clear"/>
+            <w:tcBorders>
+              <w:top w:val="single" w:sz="4" w:space="0" w:color="D9E0E7"/>
+              <w:left w:val="single" w:sz="4" w:space="0" w:color="D9E0E7"/>
+              <w:bottom w:val="single" w:sz="4" w:space="0" w:color="D9E0E7"/>
+              <w:right w:val="single" w:sz="4" w:space="0" w:color="D9E0E7"/>
+            </w:tcBorders>
+          </w:tcPr>
+          <w:p>
+            <w:r/>
+            <w:r>
+              <w:rPr>
+                <w:rFonts w:ascii="Calibri" w:hAnsi="Calibri" w:eastAsia="Calibri"/>
+                <w:b/>
+                <w:color w:val="FFFFFF"/>
+                <w:sz w:val="20"/>
+              </w:rPr>
+              <w:t>Table</w:t>
+            </w:r>
+          </w:p>
+        </w:tc>
+        <w:tc>
+          <w:tcPr>
+            <w:tcW w:type="dxa" w:w="3137"/>
+            <w:shd w:fill="1B3139" w:val="clear"/>
+            <w:tcBorders>
+              <w:top w:val="single" w:sz="4" w:space="0" w:color="D9E0E7"/>
+              <w:left w:val="single" w:sz="4" w:space="0" w:color="D9E0E7"/>
+              <w:bottom w:val="single" w:sz="4" w:space="0" w:color="D9E0E7"/>
+              <w:right w:val="single" w:sz="4" w:space="0" w:color="D9E0E7"/>
+            </w:tcBorders>
+          </w:tcPr>
+          <w:p>
+            <w:r/>
+            <w:r>
+              <w:rPr>
+                <w:rFonts w:ascii="Calibri" w:hAnsi="Calibri" w:eastAsia="Calibri"/>
+                <w:b/>
+                <w:color w:val="FFFFFF"/>
+                <w:sz w:val="20"/>
+              </w:rPr>
+              <w:t>When it grows</w:t>
+            </w:r>
+          </w:p>
+        </w:tc>
+        <w:tc>
+          <w:tcPr>
+            <w:tcW w:type="dxa" w:w="3137"/>
+            <w:shd w:fill="1B3139" w:val="clear"/>
+            <w:tcBorders>
+              <w:top w:val="single" w:sz="4" w:space="0" w:color="D9E0E7"/>
+              <w:left w:val="single" w:sz="4" w:space="0" w:color="D9E0E7"/>
+              <w:bottom w:val="single" w:sz="4" w:space="0" w:color="D9E0E7"/>
+              <w:right w:val="single" w:sz="4" w:space="0" w:color="D9E0E7"/>
+            </w:tcBorders>
+          </w:tcPr>
+          <w:p>
+            <w:r/>
+            <w:r>
+              <w:rPr>
+                <w:rFonts w:ascii="Calibri" w:hAnsi="Calibri" w:eastAsia="Calibri"/>
+                <w:b/>
+                <w:color w:val="FFFFFF"/>
+                <w:sz w:val="20"/>
+              </w:rPr>
+              <w:t>What to look for</w:t>
+            </w:r>
+          </w:p>
+        </w:tc>
+      </w:tr>
+      <w:tr>
+        <w:tc>
+          <w:tcPr>
+            <w:tcW w:type="dxa" w:w="3137"/>
+            <w:shd w:fill="FFFFFF" w:val="clear"/>
+            <w:tcBorders>
+              <w:top w:val="single" w:sz="4" w:space="0" w:color="D9E0E7"/>
+              <w:left w:val="single" w:sz="4" w:space="0" w:color="D9E0E7"/>
+              <w:bottom w:val="single" w:sz="4" w:space="0" w:color="D9E0E7"/>
+              <w:right w:val="single" w:sz="4" w:space="0" w:color="D9E0E7"/>
+            </w:tcBorders>
+          </w:tcPr>
+          <w:p>
+            <w:r/>
+            <w:r>
+              <w:rPr>
+                <w:rFonts w:ascii="Calibri" w:hAnsi="Calibri" w:eastAsia="Calibri"/>
+                <w:b w:val="0"/>
+                <w:color w:val="374151"/>
+                <w:sz w:val="19"/>
+              </w:rPr>
+              <w:t>agentforce_otel_spans</w:t>
+            </w:r>
+          </w:p>
+        </w:tc>
+        <w:tc>
+          <w:tcPr>
+            <w:tcW w:type="dxa" w:w="3137"/>
+            <w:shd w:fill="FFFFFF" w:val="clear"/>
+            <w:tcBorders>
+              <w:top w:val="single" w:sz="4" w:space="0" w:color="D9E0E7"/>
+              <w:left w:val="single" w:sz="4" w:space="0" w:color="D9E0E7"/>
+              <w:bottom w:val="single" w:sz="4" w:space="0" w:color="D9E0E7"/>
+              <w:right w:val="single" w:sz="4" w:space="0" w:color="D9E0E7"/>
+            </w:tcBorders>
+          </w:tcPr>
+          <w:p>
+            <w:r/>
+            <w:r>
+              <w:rPr>
+                <w:rFonts w:ascii="Calibri" w:hAnsi="Calibri" w:eastAsia="Calibri"/>
+                <w:b w:val="0"/>
+                <w:color w:val="374151"/>
+                <w:sz w:val="19"/>
+              </w:rPr>
+              <w:t>Every successful trace POST</w:t>
+            </w:r>
+          </w:p>
+        </w:tc>
+        <w:tc>
+          <w:tcPr>
+            <w:tcW w:type="dxa" w:w="3137"/>
+            <w:shd w:fill="FFFFFF" w:val="clear"/>
+            <w:tcBorders>
+              <w:top w:val="single" w:sz="4" w:space="0" w:color="D9E0E7"/>
+              <w:left w:val="single" w:sz="4" w:space="0" w:color="D9E0E7"/>
+              <w:bottom w:val="single" w:sz="4" w:space="0" w:color="D9E0E7"/>
+              <w:right w:val="single" w:sz="4" w:space="0" w:color="D9E0E7"/>
+            </w:tcBorders>
+          </w:tcPr>
+          <w:p>
+            <w:r/>
+            <w:r>
+              <w:rPr>
+                <w:rFonts w:ascii="Calibri" w:hAnsi="Calibri" w:eastAsia="Calibri"/>
+                <w:b w:val="0"/>
+                <w:color w:val="374151"/>
+                <w:sz w:val="19"/>
+              </w:rPr>
+              <w:t>New time; names such as GeneralCRM_*, AiCopilot__ReactInitialPrompt, CLOSED_USER_REQUEST, TaskResolution, InstructionAdherence; populated trace_id and span_id; status.code; attributes VARIANT with prompt and tool payload.</w:t>
+            </w:r>
+          </w:p>
+        </w:tc>
+      </w:tr>
+      <w:tr>
+        <w:tc>
+          <w:tcPr>
+            <w:tcW w:type="dxa" w:w="3137"/>
+            <w:shd w:fill="F5F7F9" w:val="clear"/>
+            <w:tcBorders>
+              <w:top w:val="single" w:sz="4" w:space="0" w:color="D9E0E7"/>
+              <w:left w:val="single" w:sz="4" w:space="0" w:color="D9E0E7"/>
+              <w:bottom w:val="single" w:sz="4" w:space="0" w:color="D9E0E7"/>
+              <w:right w:val="single" w:sz="4" w:space="0" w:color="D9E0E7"/>
+            </w:tcBorders>
+          </w:tcPr>
+          <w:p>
+            <w:r/>
+            <w:r>
+              <w:rPr>
+                <w:rFonts w:ascii="Calibri" w:hAnsi="Calibri" w:eastAsia="Calibri"/>
+                <w:b w:val="0"/>
+                <w:color w:val="374151"/>
+                <w:sz w:val="19"/>
+              </w:rPr>
+              <w:t>agentforce_otel_logs</w:t>
+            </w:r>
+          </w:p>
+        </w:tc>
+        <w:tc>
+          <w:tcPr>
+            <w:tcW w:type="dxa" w:w="3137"/>
+            <w:shd w:fill="F5F7F9" w:val="clear"/>
+            <w:tcBorders>
+              <w:top w:val="single" w:sz="4" w:space="0" w:color="D9E0E7"/>
+              <w:left w:val="single" w:sz="4" w:space="0" w:color="D9E0E7"/>
+              <w:bottom w:val="single" w:sz="4" w:space="0" w:color="D9E0E7"/>
+              <w:right w:val="single" w:sz="4" w:space="0" w:color="D9E0E7"/>
+            </w:tcBorders>
+          </w:tcPr>
+          <w:p>
+            <w:r/>
+            <w:r>
+              <w:rPr>
+                <w:rFonts w:ascii="Calibri" w:hAnsi="Calibri" w:eastAsia="Calibri"/>
+                <w:b w:val="0"/>
+                <w:color w:val="374151"/>
+                <w:sz w:val="19"/>
+              </w:rPr>
+              <w:t>When the session export includes log records</w:t>
+            </w:r>
+          </w:p>
+        </w:tc>
+        <w:tc>
+          <w:tcPr>
+            <w:tcW w:type="dxa" w:w="3137"/>
+            <w:shd w:fill="F5F7F9" w:val="clear"/>
+            <w:tcBorders>
+              <w:top w:val="single" w:sz="4" w:space="0" w:color="D9E0E7"/>
+              <w:left w:val="single" w:sz="4" w:space="0" w:color="D9E0E7"/>
+              <w:bottom w:val="single" w:sz="4" w:space="0" w:color="D9E0E7"/>
+              <w:right w:val="single" w:sz="4" w:space="0" w:color="D9E0E7"/>
+            </w:tcBorders>
+          </w:tcPr>
+          <w:p>
+            <w:r/>
+            <w:r>
+              <w:rPr>
+                <w:rFonts w:ascii="Calibri" w:hAnsi="Calibri" w:eastAsia="Calibri"/>
+                <w:b w:val="0"/>
+                <w:color w:val="374151"/>
+                <w:sz w:val="19"/>
+              </w:rPr>
+              <w:t>Rows sharing the same trace_id; body and severity_text.</w:t>
+            </w:r>
+          </w:p>
+        </w:tc>
+      </w:tr>
+      <w:tr>
+        <w:tc>
+          <w:tcPr>
+            <w:tcW w:type="dxa" w:w="3137"/>
+            <w:shd w:fill="FFFFFF" w:val="clear"/>
+            <w:tcBorders>
+              <w:top w:val="single" w:sz="4" w:space="0" w:color="D9E0E7"/>
+              <w:left w:val="single" w:sz="4" w:space="0" w:color="D9E0E7"/>
+              <w:bottom w:val="single" w:sz="4" w:space="0" w:color="D9E0E7"/>
+              <w:right w:val="single" w:sz="4" w:space="0" w:color="D9E0E7"/>
+            </w:tcBorders>
+          </w:tcPr>
+          <w:p>
+            <w:r/>
+            <w:r>
+              <w:rPr>
+                <w:rFonts w:ascii="Calibri" w:hAnsi="Calibri" w:eastAsia="Calibri"/>
+                <w:b w:val="0"/>
+                <w:color w:val="374151"/>
+                <w:sz w:val="19"/>
+              </w:rPr>
+              <w:t>agentforce_otel_metrics</w:t>
+            </w:r>
+          </w:p>
+        </w:tc>
+        <w:tc>
+          <w:tcPr>
+            <w:tcW w:type="dxa" w:w="3137"/>
+            <w:shd w:fill="FFFFFF" w:val="clear"/>
+            <w:tcBorders>
+              <w:top w:val="single" w:sz="4" w:space="0" w:color="D9E0E7"/>
+              <w:left w:val="single" w:sz="4" w:space="0" w:color="D9E0E7"/>
+              <w:bottom w:val="single" w:sz="4" w:space="0" w:color="D9E0E7"/>
+              <w:right w:val="single" w:sz="4" w:space="0" w:color="D9E0E7"/>
+            </w:tcBorders>
+          </w:tcPr>
+          <w:p>
+            <w:r/>
+            <w:r>
+              <w:rPr>
+                <w:rFonts w:ascii="Calibri" w:hAnsi="Calibri" w:eastAsia="Calibri"/>
+                <w:b w:val="0"/>
+                <w:color w:val="374151"/>
+                <w:sz w:val="19"/>
+              </w:rPr>
+              <w:t>When the session export includes metrics</w:t>
+            </w:r>
+          </w:p>
+        </w:tc>
+        <w:tc>
+          <w:tcPr>
+            <w:tcW w:type="dxa" w:w="3137"/>
+            <w:shd w:fill="FFFFFF" w:val="clear"/>
+            <w:tcBorders>
+              <w:top w:val="single" w:sz="4" w:space="0" w:color="D9E0E7"/>
+              <w:left w:val="single" w:sz="4" w:space="0" w:color="D9E0E7"/>
+              <w:bottom w:val="single" w:sz="4" w:space="0" w:color="D9E0E7"/>
+              <w:right w:val="single" w:sz="4" w:space="0" w:color="D9E0E7"/>
+            </w:tcBorders>
+          </w:tcPr>
+          <w:p>
+            <w:r/>
+            <w:r>
+              <w:rPr>
+                <w:rFonts w:ascii="Calibri" w:hAnsi="Calibri" w:eastAsia="Calibri"/>
+                <w:b w:val="0"/>
+                <w:color w:val="374151"/>
+                <w:sz w:val="19"/>
+              </w:rPr>
+              <w:t>Rows in the same window; metric name and points in VARIANT.</w:t>
+            </w:r>
+          </w:p>
+        </w:tc>
+      </w:tr>
+    </w:tbl>
+    <w:p/>
+    <w:p>
+      <w:pPr>
+        <w:spacing w:after="240"/>
+      </w:pPr>
+      <w:r>
+        <w:rPr>
+          <w:rFonts w:ascii="Calibri" w:hAnsi="Calibri" w:eastAsia="Calibri"/>
+          <w:b w:val="0"/>
+          <w:i/>
+          <w:color w:val="64748B"/>
+          <w:sz w:val="18"/>
+        </w:rPr>
+        <w:t>Table 5. Unity Catalog tables after a successful POST.</w:t>
+      </w:r>
+    </w:p>
+    <w:p>
+      <w:pPr>
+        <w:spacing w:after="160" w:line="240" w:lineRule="auto"/>
+        <w:jc w:val="both"/>
+      </w:pPr>
+      <w:r>
+        <w:rPr>
+          <w:rFonts w:ascii="Calibri" w:hAnsi="Calibri" w:eastAsia="Calibri"/>
+          <w:b w:val="0"/>
+          <w:color w:val="374151"/>
+          <w:sz w:val="22"/>
+        </w:rPr>
+        <w:t>A short Agentforce chat often fills spans first. Empty logs or metrics with populated spans is a valid session. Lab session 01a16cb0-5079-71ce-a37e-9aee0cb3c332 produced 8 spans and Zerobus HTTP 200. Match a new run by time descending and by name.</w:t>
+      </w:r>
+    </w:p>
+    <w:p>
+      <w:pPr>
+        <w:spacing w:after="160"/>
+      </w:pPr>
+      <w:r>
+        <w:rPr>
+          <w:rFonts w:ascii="Courier New" w:hAnsi="Courier New" w:eastAsia="Courier New"/>
+          <w:b w:val="0"/>
+          <w:color w:val="1B3139"/>
+          <w:sz w:val="17"/>
+        </w:rPr>
+        <w:t>SELECT time, service_name, name, status.code, trace_id, span_id</w:t>
+        <w:br/>
+        <w:t>FROM ot_pdm_semi_catalog.agentforce_otel.agentforce_otel_spans</w:t>
+        <w:br/>
+        <w:t>ORDER BY time DESC</w:t>
+        <w:br/>
+        <w:t>LIMIT 20;</w:t>
+      </w:r>
+    </w:p>
+    <w:p>
+      <w:pPr>
+        <w:spacing w:after="160"/>
+      </w:pPr>
+      <w:r>
+        <w:rPr>
+          <w:rFonts w:ascii="Courier New" w:hAnsi="Courier New" w:eastAsia="Courier New"/>
+          <w:b w:val="0"/>
+          <w:color w:val="1B3139"/>
+          <w:sz w:val="17"/>
+        </w:rPr>
+        <w:t>SELECT name, COUNT(*) AS spans</w:t>
+        <w:br/>
+        <w:t>FROM ot_pdm_semi_catalog.agentforce_otel.agentforce_otel_spans</w:t>
+        <w:br/>
+        <w:t>WHERE time &gt; current_timestamp() - INTERVAL 1 DAYS</w:t>
+        <w:br/>
+        <w:t>GROUP BY name</w:t>
+        <w:br/>
+        <w:t>ORDER BY spans DESC;</w:t>
+      </w:r>
+    </w:p>
+    <w:p>
+      <w:pPr>
+        <w:pStyle w:val="Heading1"/>
+      </w:pPr>
+      <w:r>
+        <w:rPr>
+          <w:rFonts w:ascii="Calibri" w:hAnsi="Calibri"/>
+          <w:color w:val="1B3139"/>
+          <w:sz w:val="32"/>
+        </w:rPr>
+        <w:t>10. Delivery implication</w:t>
+      </w:r>
+    </w:p>
+    <w:p>
+      <w:pPr>
+        <w:spacing w:after="160" w:line="240" w:lineRule="auto"/>
+        <w:jc w:val="both"/>
+      </w:pPr>
+      <w:r>
+        <w:rPr>
+          <w:rFonts w:ascii="Calibri" w:hAnsi="Calibri" w:eastAsia="Calibri"/>
+          <w:b w:val="0"/>
+          <w:color w:val="374151"/>
+          <w:sz w:val="22"/>
+        </w:rPr>
+        <w:t>Suncorp places a Zerobus client (Collector or equivalent) in its VPC, swaps workspace id, catalog, and schema, and keeps Protobuf with x-databricks-zerobus-table-name. Suncorp networking provisions the VPC endpoint and private DNS for Zerobus OTLP. The poller runs in the same VPC and authenticates to Salesforce through an External Client App. VARIANT columns keep prompt and tool payloads available for MLflow evaluation. Delta Sharing can return curated aggregates to Data Cloud once traces land in Delta.</w:t>
       </w:r>
     </w:p>
     <w:sectPr>

</xml_diff>

<commit_message>
Add an in-cluster EKS poller so Salesforce GET and Zerobus POST both run in the VPC.
The CronJob posts Protobuf to the Collector ClusterIP; laptop port-forward remains the fallback until an External Client App secret exists.
</commit_message>
<xml_diff>
--- a/docs/Suncorp_Agentforce_OTel_Databricks_Readout.docx
+++ b/docs/Suncorp_Agentforce_OTel_Databricks_Readout.docx
@@ -518,7 +518,7 @@
           <w:color w:val="374151"/>
           <w:sz w:val="22"/>
         </w:rPr>
-        <w:t xml:space="preserve"> is the poller plus a Zerobus client. The poller is the Salesforce client. The Zerobus client is the poller itself (Phase A1) or an OpenTelemetry Collector in the VPC (Phase A2). This lab hosted the Collector on EKS Fargate.</w:t>
+        <w:t xml:space="preserve"> is the poller plus a Zerobus client. The poller is the Salesforce client and runs on EKS as CronJob session-poller next to the Collector. The Collector POSTs Protobuf to Zerobus. Phase A1 posted from the laptop straight to Zerobus. The laptop port-forward remains the fallback until an External Client App secret is on the cluster.</w:t>
       </w:r>
     </w:p>
     <w:p>
@@ -1132,7 +1132,7 @@
           <w:color w:val="374151"/>
           <w:sz w:val="22"/>
         </w:rPr>
-        <w:t>The poller is the Salesforce client. It can POST Protobuf straight to Zerobus (Phase A1). The Collector is the standing Databricks client for token refresh, batching, and Private Link egress from a VPC (Phase A2). Production can host that client on EKS, ECS, a small VM, or a scheduled function.</w:t>
+        <w:t>The poller is the Salesforce client. On EKS it is CronJob session-poller in namespace agentforce-otel, POSTing to the Collector ClusterIP. It can also POST Protobuf straight to Zerobus (Phase A1). The Collector is the standing Databricks client for token refresh, batching, and Private Link egress. The CronJob needs SALESFORCE_CLIENT_ID and SALESFORCE_CLIENT_SECRET (External Client App).</w:t>
       </w:r>
     </w:p>
     <w:p>
@@ -1511,7 +1511,7 @@
                 <w:color w:val="374151"/>
                 <w:sz w:val="19"/>
               </w:rPr>
-              <w:t>Laptop in the lab; Suncorp VPC in production</w:t>
+              <w:t>EKS CronJob session-poller (same namespace as the Collector)</w:t>
             </w:r>
           </w:p>
         </w:tc>
@@ -1535,7 +1535,7 @@
                 <w:color w:val="374151"/>
                 <w:sz w:val="19"/>
               </w:rPr>
-              <w:t>Discovers finished sessions, GETs JSON, converts to Protobuf, fills empty spanIds, POSTs to the Collector or to Zerobus.</w:t>
+              <w:t>Discovers finished sessions, GETs JSON, converts to Protobuf, fills empty spanIds, POSTs to the Collector ClusterIP. Laptop port-forward is the fallback until an External Client App secret exists.</w:t>
             </w:r>
           </w:p>
         </w:tc>
@@ -2571,7 +2571,7 @@
                 <w:color w:val="374151"/>
                 <w:sz w:val="19"/>
               </w:rPr>
-              <w:t>Laptop with kubectl port-forward</w:t>
+              <w:t>EKS CronJob session-poller; laptop port-forward until ECA exists</w:t>
             </w:r>
           </w:p>
         </w:tc>
@@ -2595,7 +2595,7 @@
                 <w:color w:val="374151"/>
                 <w:sz w:val="19"/>
               </w:rPr>
-              <w:t>Same VPC as the Collector</w:t>
+              <w:t>Same namespace as the Collector</w:t>
             </w:r>
           </w:p>
         </w:tc>
@@ -2876,7 +2876,7 @@
           <w:color w:val="374151"/>
           <w:sz w:val="22"/>
         </w:rPr>
-        <w:t>POST Protobuf. Phase A1: set OTEL_COLLECTOR_TRACES_URL to https://{WORKSPACE_ID}.zerobus.{REGION}.cloud.databricks.com:443/v1/traces and run poller/poll_agentforce.py with SALESFORCE_SESSION_ID. Phase A2: kubectl port-forward svc/otel-collector 4318:4318 and POST to http://127.0.0.1:4318/v1/traces. Observe Exported N span(s) and HTTP 200. Synthetic check: python3 scripts/send_direct_zerobus.py.</w:t>
+        <w:t>POST Protobuf. Phase A1: set OTEL_COLLECTOR_TRACES_URL to the public Zerobus /v1/traces URL and run the poller with SALESFORCE_SESSION_ID. Phase A2 on EKS: kubectl -n agentforce-otel create job session-poller-once --from=cronjob/session-poller. The Job POSTs to http://otel-collector.agentforce-otel.svc.cluster.local:4318/v1/traces. Observe Exported N span(s) and HTTP 200 in the Job logs. Laptop fallback: kubectl port-forward and POST to 127.0.0.1:4318. Synthetic check: python3 scripts/send_direct_zerobus.py.</w:t>
       </w:r>
     </w:p>
     <w:p>

</xml_diff>